<commit_message>
Connection en local fonctionnel, et serveur mySQL fonctionel
</commit_message>
<xml_diff>
--- a/cahier_des_charges.docx
+++ b/cahier_des_charges.docx
@@ -95,17 +95,12 @@
       <w:r>
         <w:t xml:space="preserve">Mise en place d’un chat général libre en utilisant HTML </w:t>
       </w:r>
-      <w:proofErr w:type="gramStart"/>
-      <w:r>
-        <w:t xml:space="preserve">CSS, </w:t>
-      </w:r>
-      <w:r>
-        <w:t xml:space="preserve"> </w:t>
-      </w:r>
-      <w:r>
-        <w:t>PHP</w:t>
-      </w:r>
-      <w:proofErr w:type="gramEnd"/>
+      <w:r>
+        <w:t xml:space="preserve">CSS, PHP, et une connexion </w:t>
+      </w:r>
+      <w:r>
+        <w:t>MySQL</w:t>
+      </w:r>
     </w:p>
     <w:p/>
     <w:p>
@@ -220,6 +215,7 @@
         <w:pStyle w:val="Titre2"/>
       </w:pPr>
       <w:r>
+        <w:lastRenderedPageBreak/>
         <w:t xml:space="preserve">Gestion utilisateurs </w:t>
       </w:r>
     </w:p>
@@ -232,20 +228,13 @@
         </w:numPr>
       </w:pPr>
       <w:r>
-        <w:t>Obligation de mettre un pseudo par session afin d’entrer dans le chat général et d’envoyer un message</w:t>
-      </w:r>
-    </w:p>
-    <w:p>
-      <w:pPr>
-        <w:pStyle w:val="Paragraphedeliste"/>
-        <w:numPr>
-          <w:ilvl w:val="0"/>
-          <w:numId w:val="4"/>
-        </w:numPr>
-      </w:pPr>
-      <w:r>
-        <w:lastRenderedPageBreak/>
-        <w:t xml:space="preserve">Pas de login obligatoire ni de compte </w:t>
+        <w:t xml:space="preserve">Obligation de mettre un pseudo par session </w:t>
+      </w:r>
+      <w:r>
+        <w:t xml:space="preserve">(sans mot de passe) </w:t>
+      </w:r>
+      <w:r>
+        <w:t>afin d’entrer dans le chat général et d’envoyer un message</w:t>
       </w:r>
     </w:p>
     <w:p>
@@ -267,6 +256,9 @@
       <w:r>
         <w:t>Affichage en temps réel</w:t>
       </w:r>
+      <w:r>
+        <w:t xml:space="preserve"> (toutes les 2s)</w:t>
+      </w:r>
     </w:p>
     <w:p>
       <w:pPr>
@@ -277,10 +269,18 @@
         </w:numPr>
       </w:pPr>
       <w:r>
-        <w:t>Historique limité aux derniers messages afin d’éviter d’avoir un fichier trop lourd</w:t>
-      </w:r>
-    </w:p>
-    <w:p/>
+        <w:t xml:space="preserve">Historique </w:t>
+      </w:r>
+      <w:r>
+        <w:t>il</w:t>
+      </w:r>
+      <w:r>
+        <w:t xml:space="preserve">limité </w:t>
+      </w:r>
+      <w:r>
+        <w:t>à l’infini grâce à notre serveur MySQL</w:t>
+      </w:r>
+    </w:p>
     <w:p>
       <w:pPr>
         <w:pStyle w:val="Titre1"/>
@@ -356,15 +356,6 @@
       <w:r>
         <w:t>SQL</w:t>
       </w:r>
-      <w:r>
-        <w:t xml:space="preserve"> (</w:t>
-      </w:r>
-      <w:r>
-        <w:t>provisoire</w:t>
-      </w:r>
-      <w:r>
-        <w:t>)</w:t>
-      </w:r>
     </w:p>
     <w:p>
       <w:pPr>
@@ -388,7 +379,7 @@
         <w:t>MySQL</w:t>
       </w:r>
       <w:r>
-        <w:t xml:space="preserve"> + PhpMyAdmin</w:t>
+        <w:t xml:space="preserve"> </w:t>
       </w:r>
     </w:p>
     <w:p/>
@@ -402,38 +393,10 @@
     </w:p>
     <w:p>
       <w:r>
-        <w:t>Serveur PHP compatible</w:t>
-      </w:r>
-      <w:r>
-        <w:t xml:space="preserve"> (</w:t>
-      </w:r>
-      <w:r>
-        <w:rPr>
-          <w:b/>
-          <w:bCs/>
-        </w:rPr>
-        <w:t>000</w:t>
-      </w:r>
-      <w:proofErr w:type="gramStart"/>
-      <w:r>
-        <w:rPr>
-          <w:b/>
-          <w:bCs/>
-        </w:rPr>
-        <w:t>webhost</w:t>
-      </w:r>
-      <w:r>
-        <w:t>)</w:t>
-      </w:r>
-      <w:r>
-        <w:t>(</w:t>
-      </w:r>
-      <w:proofErr w:type="gramEnd"/>
-      <w:r>
-        <w:t>provisoire</w:t>
-      </w:r>
-      <w:r>
-        <w:t>)</w:t>
+        <w:t>Hébergé</w:t>
+      </w:r>
+      <w:r>
+        <w:t xml:space="preserve"> en local via Apache</w:t>
       </w:r>
     </w:p>
     <w:p>
@@ -469,7 +432,10 @@
       </w:pPr>
       <w:proofErr w:type="spellStart"/>
       <w:r>
-        <w:t>Anarchy.php</w:t>
+        <w:t>a</w:t>
+      </w:r>
+      <w:r>
+        <w:t>narchy.php</w:t>
       </w:r>
       <w:proofErr w:type="spellEnd"/>
     </w:p>
@@ -483,7 +449,10 @@
       </w:pPr>
       <w:proofErr w:type="spellStart"/>
       <w:r>
-        <w:t>Get_messages.php</w:t>
+        <w:t>g</w:t>
+      </w:r>
+      <w:r>
+        <w:t>et_messages.php</w:t>
       </w:r>
       <w:proofErr w:type="spellEnd"/>
     </w:p>
@@ -497,27 +466,10 @@
       </w:pPr>
       <w:proofErr w:type="spellStart"/>
       <w:r>
-        <w:t>Index.php</w:t>
-      </w:r>
-      <w:proofErr w:type="spellEnd"/>
-    </w:p>
-    <w:p>
-      <w:pPr>
-        <w:pStyle w:val="Paragraphedeliste"/>
-        <w:numPr>
-          <w:ilvl w:val="0"/>
-          <w:numId w:val="7"/>
-        </w:numPr>
-      </w:pPr>
-      <w:proofErr w:type="spellStart"/>
-      <w:r>
-        <w:t>s</w:t>
-      </w:r>
-      <w:r>
-        <w:t>end</w:t>
-      </w:r>
-      <w:r>
-        <w:t>_images.php</w:t>
+        <w:t>i</w:t>
+      </w:r>
+      <w:r>
+        <w:t>ndex.php</w:t>
       </w:r>
       <w:proofErr w:type="spellEnd"/>
     </w:p>

</xml_diff>